<commit_message>
Update 2026 proposal template
</commit_message>
<xml_diff>
--- a/assets/call-2026/Proposal_Template.docx
+++ b/assets/call-2026/Proposal_Template.docx
@@ -1876,25 +1876,7 @@
                 <w:sz w:val="22"/>
                 <w:szCs w:val="22"/>
               </w:rPr>
-              <w:t>(dd/mm/</w:t>
-            </w:r>
-            <w:proofErr w:type="spellStart"/>
-            <w:r>
-              <w:rPr>
-                <w:color w:val="000000"/>
-                <w:sz w:val="22"/>
-                <w:szCs w:val="22"/>
-              </w:rPr>
-              <w:t>yyyy</w:t>
-            </w:r>
-            <w:proofErr w:type="spellEnd"/>
-            <w:r>
-              <w:rPr>
-                <w:color w:val="000000"/>
-                <w:sz w:val="22"/>
-                <w:szCs w:val="22"/>
-              </w:rPr>
-              <w:t>)</w:t>
+              <w:t>(dd/mm/yyyy)</w:t>
             </w:r>
           </w:p>
         </w:tc>
@@ -5654,43 +5636,7 @@
           <w:sz w:val="22"/>
           <w:szCs w:val="22"/>
         </w:rPr>
-        <w:t> Our consortium meets the eligibility requirements for the selected proposal type (</w:t>
-      </w:r>
-      <w:proofErr w:type="spellStart"/>
-      <w:r>
-        <w:rPr>
-          <w:color w:val="000000"/>
-          <w:sz w:val="22"/>
-          <w:szCs w:val="22"/>
-        </w:rPr>
-        <w:t>Communitysprint</w:t>
-      </w:r>
-      <w:proofErr w:type="spellEnd"/>
-      <w:r>
-        <w:rPr>
-          <w:color w:val="000000"/>
-          <w:sz w:val="22"/>
-          <w:szCs w:val="22"/>
-        </w:rPr>
-        <w:t xml:space="preserve">, </w:t>
-      </w:r>
-      <w:proofErr w:type="spellStart"/>
-      <w:r>
-        <w:rPr>
-          <w:color w:val="000000"/>
-          <w:sz w:val="22"/>
-          <w:szCs w:val="22"/>
-        </w:rPr>
-        <w:t>Praxisprint</w:t>
-      </w:r>
-      <w:proofErr w:type="spellEnd"/>
-      <w:r>
-        <w:rPr>
-          <w:color w:val="000000"/>
-          <w:sz w:val="22"/>
-          <w:szCs w:val="22"/>
-        </w:rPr>
-        <w:t>).</w:t>
+        <w:t> Our consortium meets the eligibility requirements for the selected proposal type (Communitysprint, Praxisprint).</w:t>
       </w:r>
     </w:p>
     <w:p>
@@ -5902,7 +5848,15 @@
           <w:sz w:val="22"/>
           <w:szCs w:val="22"/>
         </w:rPr>
-        <w:t>04</w:t>
+        <w:t>0</w:t>
+      </w:r>
+      <w:r>
+        <w:rPr>
+          <w:color w:val="000000"/>
+          <w:sz w:val="22"/>
+          <w:szCs w:val="22"/>
+        </w:rPr>
+        <w:t>5</w:t>
       </w:r>
       <w:r>
         <w:rPr>
@@ -5926,7 +5880,23 @@
           <w:sz w:val="22"/>
           <w:szCs w:val="22"/>
         </w:rPr>
-        <w:t xml:space="preserve">, with all projects ending by </w:t>
+        <w:t>, with all projects ending</w:t>
+      </w:r>
+      <w:r>
+        <w:rPr>
+          <w:color w:val="000000"/>
+          <w:sz w:val="22"/>
+          <w:szCs w:val="22"/>
+        </w:rPr>
+        <w:t xml:space="preserve"> latest</w:t>
+      </w:r>
+      <w:r>
+        <w:rPr>
+          <w:color w:val="000000"/>
+          <w:sz w:val="22"/>
+          <w:szCs w:val="22"/>
+        </w:rPr>
+        <w:t xml:space="preserve"> by </w:t>
       </w:r>
       <w:sdt>
         <w:sdtPr>
@@ -5965,7 +5935,7 @@
           <w:sz w:val="22"/>
           <w:szCs w:val="22"/>
         </w:rPr>
-        <w:t>09</w:t>
+        <w:t>10</w:t>
       </w:r>
       <w:r>
         <w:rPr>
@@ -6264,25 +6234,7 @@
           <w:sz w:val="22"/>
           <w:szCs w:val="22"/>
         </w:rPr>
-        <w:t xml:space="preserve"> We acknowledge that funding recommendations are subject to expert review, interview evaluation and </w:t>
-      </w:r>
-      <w:proofErr w:type="spellStart"/>
-      <w:r>
-        <w:rPr>
-          <w:color w:val="000000"/>
-          <w:sz w:val="22"/>
-          <w:szCs w:val="22"/>
-        </w:rPr>
-        <w:t>PtJ’s</w:t>
-      </w:r>
-      <w:proofErr w:type="spellEnd"/>
-      <w:r>
-        <w:rPr>
-          <w:color w:val="000000"/>
-          <w:sz w:val="22"/>
-          <w:szCs w:val="22"/>
-        </w:rPr>
-        <w:t xml:space="preserve"> legal/financial eligibility ch</w:t>
+        <w:t> We acknowledge that funding recommendations are subject to expert review, interview evaluation and PtJ’s legal/financial eligibility ch</w:t>
       </w:r>
       <w:r>
         <w:rPr>
@@ -6342,25 +6294,7 @@
           <w:sz w:val="22"/>
           <w:szCs w:val="22"/>
         </w:rPr>
-        <w:t>BMBFTR/</w:t>
-      </w:r>
-      <w:proofErr w:type="spellStart"/>
-      <w:r>
-        <w:rPr>
-          <w:color w:val="000000"/>
-          <w:sz w:val="22"/>
-          <w:szCs w:val="22"/>
-        </w:rPr>
-        <w:t>PtJ</w:t>
-      </w:r>
-      <w:proofErr w:type="spellEnd"/>
-      <w:r>
-        <w:rPr>
-          <w:color w:val="000000"/>
-          <w:sz w:val="22"/>
-          <w:szCs w:val="22"/>
-        </w:rPr>
-        <w:t xml:space="preserve"> via easy-Online.</w:t>
+        <w:t>BMBFTR/PtJ via easy-Online.</w:t>
       </w:r>
     </w:p>
     <w:p>
@@ -6600,7 +6534,7 @@
         <w:sz w:val="20"/>
         <w:szCs w:val="20"/>
       </w:rPr>
-      <w:t>Version 1</w:t>
+      <w:t xml:space="preserve">Version </w:t>
     </w:r>
     <w:r>
       <w:rPr>
@@ -6609,7 +6543,7 @@
         <w:sz w:val="20"/>
         <w:szCs w:val="20"/>
       </w:rPr>
-      <w:t>6</w:t>
+      <w:t>22</w:t>
     </w:r>
     <w:r>
       <w:rPr>
@@ -7449,6 +7383,7 @@
   <w:style w:type="character" w:default="1" w:styleId="Absatz-Standardschriftart">
     <w:name w:val="Default Paragraph Font"/>
     <w:uiPriority w:val="1"/>
+    <w:semiHidden/>
     <w:unhideWhenUsed/>
   </w:style>
   <w:style w:type="table" w:default="1" w:styleId="NormaleTabelle">

</xml_diff>